<commit_message>
Feature PHAGE-X and rank projects by impact
</commit_message>
<xml_diff>
--- a/Jeyanth_Ravi_CS_Resume.docx
+++ b/Jeyanth_Ravi_CS_Resume.docx
@@ -122,7 +122,7 @@
           <w:color w:val="1A202C"/>
           <w:sz w:val="18"/>
         </w:rPr>
-        <w:t>Computer science student building practical AI/ML systems across multimodal computer vision, language-model adaptation, medical imaging, natural language processing, and full-stack applications. Hands-on with Python, PyTorch, Transformers, Next.js, reproducible evaluation, and tested ML pipelines.</w:t>
+        <w:t>Computer science student building practical AI/ML systems across bioinformatics, multimodal computer vision, language-model adaptation, medical imaging, natural language processing, and full-stack applications. Hands-on with Python, PyTorch, Transformers, Next.js, reproducible evaluation, and tested ML pipelines.</w:t>
       </w:r>
     </w:p>
     <w:p>
@@ -213,7 +213,7 @@
           <w:color w:val="1A202C"/>
           <w:sz w:val="18"/>
         </w:rPr>
-        <w:t>PyTorch, Transformers, YOLO, BLIP-2, BERT, QLoRA, PEFT/LoRA, scikit-learn</w:t>
+        <w:t>PyTorch, Transformers, ESM-2, XGBoost, YOLO, BLIP-2, BERT, QLoRA, scikit-learn</w:t>
       </w:r>
     </w:p>
     <w:p>
@@ -235,7 +235,7 @@
           <w:color w:val="1A202C"/>
           <w:sz w:val="18"/>
         </w:rPr>
-        <w:t>Computer vision, multimodal learning, NLP, medical imaging, benchmarking, statistical evaluation</w:t>
+        <w:t>Bioinformatics, computer vision, multimodal learning, NLP, medical imaging, benchmarking</w:t>
       </w:r>
     </w:p>
     <w:p>
@@ -284,7 +284,57 @@
           <w:color w:val="1A202C"/>
           <w:sz w:val="19"/>
         </w:rPr>
-        <w:t>VisualQA India - Multimodal Road-Safety Analysis</w:t>
+        <w:t>PHAGE-X - Explainable Phage Candidate Prioritization</w:t>
+      </w:r>
+      <w:r>
+        <w:rPr>
+          <w:rFonts w:ascii="Arial" w:hAnsi="Arial"/>
+          <w:i/>
+          <w:color w:val="505A69"/>
+          <w:sz w:val="18"/>
+        </w:rPr>
+        <w:t xml:space="preserve">  |  Python, ESM-2, XGBoost, FastAPI, React</w:t>
+      </w:r>
+    </w:p>
+    <w:p>
+      <w:pPr>
+        <w:pStyle w:val="ResumeBullet"/>
+      </w:pPr>
+      <w:r>
+        <w:rPr>
+          <w:rFonts w:ascii="Arial" w:hAnsi="Arial"/>
+          <w:color w:val="1A202C"/>
+          <w:sz w:val="18"/>
+        </w:rPr>
+        <w:t>Built an offline research platform that converts a Klebsiella pneumoniae isolate or FASTA into an explainable phage shortlist and complementary 2-3 member laboratory-testing candidate.</w:t>
+      </w:r>
+    </w:p>
+    <w:p>
+      <w:pPr>
+        <w:pStyle w:val="ResumeBullet"/>
+      </w:pPr>
+      <w:r>
+        <w:rPr>
+          <w:rFonts w:ascii="Arial" w:hAnsi="Arial"/>
+          <w:color w:val="1A202C"/>
+          <w:sz w:val="18"/>
+        </w:rPr>
+        <w:t>Implemented host-disjoint PhageHostLearn evaluation, ESM-2 feature interfaces, evidence-gated ranking, FastAPI services, and a React UI; achieved 0.885 AUROC and 0.895 top-5 recall on the fixed test split.</w:t>
+      </w:r>
+    </w:p>
+    <w:p>
+      <w:pPr>
+        <w:pStyle w:val="ProjectHeader"/>
+        <w:keepNext/>
+      </w:pPr>
+      <w:r>
+        <w:rPr>
+          <w:rFonts w:ascii="Arial" w:hAnsi="Arial"/>
+          <w:b/>
+          <w:color w:val="1A202C"/>
+          <w:sz w:val="19"/>
+        </w:rPr>
+        <w:t>Amazon ML Challenge 2026 - Business Entity Resolution</w:t>
       </w:r>
       <w:r>
         <w:t xml:space="preserve">  </w:t>
@@ -306,7 +356,7 @@
           <w:color w:val="505A69"/>
           <w:sz w:val="18"/>
         </w:rPr>
-        <w:t xml:space="preserve">  |  Python, PyTorch, YOLO, BLIP-2</w:t>
+        <w:t xml:space="preserve">  |  Python, SQLite FTS5, Feature Engineering, Boosted Trees</w:t>
       </w:r>
     </w:p>
     <w:p>
@@ -319,20 +369,7 @@
           <w:color w:val="1A202C"/>
           <w:sz w:val="18"/>
         </w:rPr>
-        <w:t>Combined YOLO road-damage detection with BLIP-2 visual question answering to analyze potholes, cracks, road conditions, and flood imagery.</w:t>
-      </w:r>
-    </w:p>
-    <w:p>
-      <w:pPr>
-        <w:pStyle w:val="ResumeBullet"/>
-      </w:pPr>
-      <w:r>
-        <w:rPr>
-          <w:rFonts w:ascii="Arial" w:hAnsi="Arial"/>
-          <w:color w:val="1A202C"/>
-          <w:sz w:val="18"/>
-        </w:rPr>
-        <w:t>Built annotated evidence outputs and a deterministic 0-100 safety score, with Kaggle GPU training, threshold evaluation, and interactive inference workflows.</w:t>
+        <w:t>Co-built a resumable matching pipeline with country-specific retrieval and 23 similarity features; achieved 0.857 public macro F0.5 and 96.18% held-out precision.</w:t>
       </w:r>
     </w:p>
     <w:p>
@@ -410,12 +447,75 @@
           <w:color w:val="1A202C"/>
           <w:sz w:val="19"/>
         </w:rPr>
+        <w:t>VisualQA India - Multimodal Road-Safety Analysis</w:t>
+      </w:r>
+      <w:r>
+        <w:t xml:space="preserve">  </w:t>
+      </w:r>
+      <w:hyperlink r:id="rId14">
+        <w:r>
+          <w:rPr>
+            <w:rFonts w:ascii="Arial" w:hAnsi="Arial"/>
+            <w:color w:val="17365D"/>
+            <w:sz w:val="19"/>
+          </w:rPr>
+          <w:t>GitHub</w:t>
+        </w:r>
+      </w:hyperlink>
+      <w:r>
+        <w:rPr>
+          <w:rFonts w:ascii="Arial" w:hAnsi="Arial"/>
+          <w:i/>
+          <w:color w:val="505A69"/>
+          <w:sz w:val="18"/>
+        </w:rPr>
+        <w:t xml:space="preserve">  |  Python, PyTorch, YOLO, BLIP-2</w:t>
+      </w:r>
+    </w:p>
+    <w:p>
+      <w:pPr>
+        <w:pStyle w:val="ResumeBullet"/>
+      </w:pPr>
+      <w:r>
+        <w:rPr>
+          <w:rFonts w:ascii="Arial" w:hAnsi="Arial"/>
+          <w:color w:val="1A202C"/>
+          <w:sz w:val="18"/>
+        </w:rPr>
+        <w:t>Combined YOLO road-damage detection with BLIP-2 visual question answering to analyze potholes, cracks, road conditions, and flood imagery.</w:t>
+      </w:r>
+    </w:p>
+    <w:p>
+      <w:pPr>
+        <w:pStyle w:val="ResumeBullet"/>
+      </w:pPr>
+      <w:r>
+        <w:rPr>
+          <w:rFonts w:ascii="Arial" w:hAnsi="Arial"/>
+          <w:color w:val="1A202C"/>
+          <w:sz w:val="18"/>
+        </w:rPr>
+        <w:t>Built annotated evidence outputs and a deterministic 0-100 safety score, with Kaggle GPU training and interactive inference workflows.</w:t>
+      </w:r>
+    </w:p>
+    <w:p>
+      <w:pPr>
+        <w:pStyle w:val="ProjectHeader"/>
+        <w:keepNext/>
+      </w:pPr>
+      <w:r>
+        <w:rPr>
+          <w:rFonts w:ascii="Arial" w:hAnsi="Arial"/>
+          <w:b/>
+          <w:color w:val="1A202C"/>
+          <w:sz w:val="19"/>
+        </w:rPr>
         <w:t>Llama 3.2 1B QLoRA Fine-Tuning</w:t>
       </w:r>
       <w:r>
         <w:t xml:space="preserve">  </w:t>
       </w:r>
-      <w:hyperlink r:id="rId14">
+      <w:hyperlink r:id="rId15">
         <w:r>
           <w:rPr>
             <w:rFonts w:ascii="Arial" w:hAnsi="Arial"/>
@@ -445,7 +545,7 @@
           <w:color w:val="1A202C"/>
           <w:sz w:val="18"/>
         </w:rPr>
-        <w:t>Built an end-to-end 4-bit QLoRA SFT pipeline over FineTome-100k with schema conversion, chat-template formatting, adapter export, loss visualization, and inference.</w:t>
+        <w:t>Built an end-to-end 4-bit QLoRA SFT pipeline over FineTome-100k with adapter export, loss visualization, and inference.</w:t>
       </w:r>
     </w:p>
     <w:p>
@@ -458,120 +558,7 @@
           <w:color w:val="1A202C"/>
           <w:sz w:val="18"/>
         </w:rPr>
-        <w:t>Verified a T4 smoke run on 2,000 examples in 177 seconds using 11.27M trainable parameters (0.90% of the model), reaching 0.9259 aggregate training loss.</w:t>
-      </w:r>
-    </w:p>
-    <w:p>
-      <w:pPr>
-        <w:pStyle w:val="ProjectHeader"/>
-        <w:keepNext/>
-      </w:pPr>
-      <w:r>
-        <w:rPr>
-          <w:rFonts w:ascii="Arial" w:hAnsi="Arial"/>
-          <w:b/>
-          <w:color w:val="1A202C"/>
-          <w:sz w:val="19"/>
-        </w:rPr>
-        <w:t>Brain Tumor MRI Architecture Benchmark</w:t>
-      </w:r>
-      <w:r>
-        <w:t xml:space="preserve">  </w:t>
-      </w:r>
-      <w:hyperlink r:id="rId15">
-        <w:r>
-          <w:rPr>
-            <w:rFonts w:ascii="Arial" w:hAnsi="Arial"/>
-            <w:color w:val="17365D"/>
-            <w:sz w:val="19"/>
-          </w:rPr>
-          <w:t>GitHub</w:t>
-        </w:r>
-      </w:hyperlink>
-      <w:r>
-        <w:rPr>
-          <w:rFonts w:ascii="Arial" w:hAnsi="Arial"/>
-          <w:i/>
-          <w:color w:val="505A69"/>
-          <w:sz w:val="18"/>
-        </w:rPr>
-        <w:t xml:space="preserve">  |  PyTorch, torchvision, timm, scikit-learn</w:t>
-      </w:r>
-    </w:p>
-    <w:p>
-      <w:pPr>
-        <w:pStyle w:val="ResumeBullet"/>
-      </w:pPr>
-      <w:r>
-        <w:rPr>
-          <w:rFonts w:ascii="Arial" w:hAnsi="Arial"/>
-          <w:color w:val="1A202C"/>
-          <w:sz w:val="18"/>
-        </w:rPr>
-        <w:t>Implemented a reproducible four-class MRI suite comparing six architectures: custom CNN, ResNet-18, DenseNet-121, Xception, ViT, and PVT v2.</w:t>
-      </w:r>
-    </w:p>
-    <w:p>
-      <w:pPr>
-        <w:pStyle w:val="ResumeBullet"/>
-      </w:pPr>
-      <w:r>
-        <w:rPr>
-          <w:rFonts w:ascii="Arial" w:hAnsi="Arial"/>
-          <w:color w:val="1A202C"/>
-          <w:sz w:val="18"/>
-        </w:rPr>
-        <w:t>Standardized dataset loading and exported model weights, per-class metrics, confusion matrices, and training visualizations for each architecture.</w:t>
-      </w:r>
-    </w:p>
-    <w:p>
-      <w:pPr>
-        <w:pStyle w:val="ProjectHeader"/>
-        <w:keepNext/>
-      </w:pPr>
-      <w:r>
-        <w:rPr>
-          <w:rFonts w:ascii="Arial" w:hAnsi="Arial"/>
-          <w:b/>
-          <w:color w:val="1A202C"/>
-          <w:sz w:val="19"/>
-        </w:rPr>
-        <w:t>BERT Movie Review Sentiment Classifier</w:t>
-      </w:r>
-      <w:r>
-        <w:t xml:space="preserve">  </w:t>
-      </w:r>
-      <w:hyperlink r:id="rId16">
-        <w:r>
-          <w:rPr>
-            <w:rFonts w:ascii="Arial" w:hAnsi="Arial"/>
-            <w:color w:val="17365D"/>
-            <w:sz w:val="19"/>
-          </w:rPr>
-          <w:t>GitHub</w:t>
-        </w:r>
-      </w:hyperlink>
-      <w:r>
-        <w:rPr>
-          <w:rFonts w:ascii="Arial" w:hAnsi="Arial"/>
-          <w:i/>
-          <w:color w:val="505A69"/>
-          <w:sz w:val="18"/>
-        </w:rPr>
-        <w:t xml:space="preserve">  |  BERT, Hugging Face Transformers, PyTorch</w:t>
-      </w:r>
-    </w:p>
-    <w:p>
-      <w:pPr>
-        <w:pStyle w:val="ResumeBullet"/>
-      </w:pPr>
-      <w:r>
-        <w:rPr>
-          <w:rFonts w:ascii="Arial" w:hAnsi="Arial"/>
-          <w:color w:val="1A202C"/>
-          <w:sz w:val="18"/>
-        </w:rPr>
-        <w:t>Implemented configurable BERT fine-tuning on IMDb reviews with accuracy and weighted-F1 evaluation, mixed precision, saved-model inference, and confidence-scored CLI predictions.</w:t>
+        <w:t>Verified a T4 run on 2,000 examples in 177 seconds using 11.27M trainable parameters (0.90% of the model).</w:t>
       </w:r>
     </w:p>
     <w:p>
@@ -597,7 +584,7 @@
           <w:color w:val="1A202C"/>
           <w:sz w:val="18"/>
         </w:rPr>
-        <w:t>Amazon ML Challenge 2026</w:t>
+        <w:t>Brain Tumor MRI Benchmark</w:t>
       </w:r>
       <w:r>
         <w:rPr>
@@ -605,7 +592,24 @@
           <w:color w:val="1A202C"/>
           <w:sz w:val="17"/>
         </w:rPr>
-        <w:t xml:space="preserve"> - two-person entity-resolution pipeline with SQLite candidate retrieval and boosted-tree matching; achieved 0.857 public macro F0.5.  </w:t>
+        <w:t xml:space="preserve"> - compared six CNN and Transformer architectures across four MRI classes.  </w:t>
+      </w:r>
+      <w:r>
+        <w:rPr>
+          <w:rFonts w:ascii="Arial" w:hAnsi="Arial"/>
+          <w:b/>
+          <w:color w:val="1A202C"/>
+          <w:sz w:val="18"/>
+        </w:rPr>
+        <w:t>BERT Sentiment</w:t>
+      </w:r>
+      <w:r>
+        <w:rPr>
+          <w:rFonts w:ascii="Arial" w:hAnsi="Arial"/>
+          <w:color w:val="1A202C"/>
+          <w:sz w:val="17"/>
+        </w:rPr>
+        <w:t xml:space="preserve"> - IMDb fine-tuning with weighted-F1 evaluation and confidence-scored inference.  </w:t>
       </w:r>
       <w:r>
         <w:rPr>
@@ -622,7 +626,7 @@
           <w:color w:val="1A202C"/>
           <w:sz w:val="17"/>
         </w:rPr>
-        <w:t xml:space="preserve"> - validated scikit-learn pipeline with deterministic splits, MAE/MSE/RMSE/R2, persistence, prediction CLI, plots, and tests.</w:t>
+        <w:t xml:space="preserve"> - validated scikit-learn workflow with persistence, CLI prediction, plots, and tests.</w:t>
       </w:r>
     </w:p>
     <w:sectPr>

</xml_diff>

<commit_message>
fix: publish PHAGE-X repository link
</commit_message>
<xml_diff>
--- a/Jeyanth_Ravi_CS_Resume.docx
+++ b/Jeyanth_Ravi_CS_Resume.docx
@@ -287,6 +287,19 @@
         <w:t>PHAGE-X - Explainable Phage Candidate Prioritization</w:t>
       </w:r>
       <w:r>
+        <w:t xml:space="preserve">  </w:t>
+      </w:r>
+      <w:hyperlink r:id="rId12">
+        <w:r>
+          <w:rPr>
+            <w:rFonts w:ascii="Arial" w:hAnsi="Arial"/>
+            <w:color w:val="17365D"/>
+            <w:sz w:val="19"/>
+          </w:rPr>
+          <w:t>GitHub</w:t>
+        </w:r>
+      </w:hyperlink>
+      <w:r>
         <w:rPr>
           <w:rFonts w:ascii="Arial" w:hAnsi="Arial"/>
           <w:i/>
@@ -339,7 +352,7 @@
       <w:r>
         <w:t xml:space="preserve">  </w:t>
       </w:r>
-      <w:hyperlink r:id="rId12">
+      <w:hyperlink r:id="rId13">
         <w:r>
           <w:rPr>
             <w:rFonts w:ascii="Arial" w:hAnsi="Arial"/>
@@ -389,7 +402,7 @@
       <w:r>
         <w:t xml:space="preserve">  </w:t>
       </w:r>
-      <w:hyperlink r:id="rId13">
+      <w:hyperlink r:id="rId14">
         <w:r>
           <w:rPr>
             <w:rFonts w:ascii="Arial" w:hAnsi="Arial"/>
@@ -452,7 +465,7 @@
       <w:r>
         <w:t xml:space="preserve">  </w:t>
       </w:r>
-      <w:hyperlink r:id="rId14">
+      <w:hyperlink r:id="rId15">
         <w:r>
           <w:rPr>
             <w:rFonts w:ascii="Arial" w:hAnsi="Arial"/>
@@ -515,7 +528,7 @@
       <w:r>
         <w:t xml:space="preserve">  </w:t>
       </w:r>
-      <w:hyperlink r:id="rId15">
+      <w:hyperlink r:id="rId16">
         <w:r>
           <w:rPr>
             <w:rFonts w:ascii="Arial" w:hAnsi="Arial"/>

</xml_diff>

<commit_message>
docs: add summer research experience to resume
</commit_message>
<xml_diff>
--- a/Jeyanth_Ravi_CS_Resume.docx
+++ b/Jeyanth_Ravi_CS_Resume.docx
@@ -158,6 +158,68 @@
         </w:rPr>
         <w:br/>
         <w:t>Relevant coursework: Data Structures &amp; Algorithms, DBMS, Operating Systems, Computer Networks, Machine Learning</w:t>
+      </w:r>
+    </w:p>
+    <w:p>
+      <w:pPr>
+        <w:pStyle w:val="Heading1"/>
+        <w:keepNext/>
+        <w:pBdr>
+          <w:bottom w:val="single" w:sz="7" w:space="2" w:color="17365D"/>
+        </w:pBdr>
+      </w:pPr>
+      <w:r>
+        <w:t>RESEARCH EXPERIENCE</w:t>
+      </w:r>
+    </w:p>
+    <w:p>
+      <w:pPr>
+        <w:pStyle w:val="ProjectHeader"/>
+        <w:keepNext/>
+      </w:pPr>
+      <w:r>
+        <w:rPr>
+          <w:rFonts w:ascii="Arial" w:hAnsi="Arial"/>
+          <w:b/>
+          <w:color w:val="1A202C"/>
+          <w:sz w:val="19"/>
+        </w:rPr>
+        <w:t>Summer Research Intern</w:t>
+      </w:r>
+      <w:r>
+        <w:rPr>
+          <w:rFonts w:ascii="Arial" w:hAnsi="Arial"/>
+          <w:i/>
+          <w:color w:val="505A69"/>
+          <w:sz w:val="18"/>
+        </w:rPr>
+        <w:t xml:space="preserve">  |  Centre for Cyber-Physical Systems, VIT Chennai  |  Summer 2026</w:t>
+      </w:r>
+    </w:p>
+    <w:p>
+      <w:pPr>
+        <w:pStyle w:val="ResumeBullet"/>
+      </w:pPr>
+      <w:r>
+        <w:rPr>
+          <w:rFonts w:ascii="Arial" w:hAnsi="Arial"/>
+          <w:color w:val="1A202C"/>
+          <w:sz w:val="18"/>
+        </w:rPr>
+        <w:t>Conducted a structured literature review, comparing existing approaches, research findings, limitations, and open problems in cyber-physical systems.</w:t>
+      </w:r>
+    </w:p>
+    <w:p>
+      <w:pPr>
+        <w:pStyle w:val="ResumeBullet"/>
+      </w:pPr>
+      <w:r>
+        <w:rPr>
+          <w:rFonts w:ascii="Arial" w:hAnsi="Arial"/>
+          <w:color w:val="1A202C"/>
+          <w:sz w:val="18"/>
+        </w:rPr>
+        <w:t>Synthesized academic evidence into a review manuscript that is currently in preparation and has not yet been published.</w:t>
       </w:r>
     </w:p>
     <w:p>

</xml_diff>

<commit_message>
docs: specify SSL medical imaging research topic
</commit_message>
<xml_diff>
--- a/Jeyanth_Ravi_CS_Resume.docx
+++ b/Jeyanth_Ravi_CS_Resume.docx
@@ -206,7 +206,7 @@
           <w:color w:val="1A202C"/>
           <w:sz w:val="18"/>
         </w:rPr>
-        <w:t>Conducted a structured literature review, comparing existing approaches, research findings, limitations, and open problems in cyber-physical systems.</w:t>
+        <w:t>Conducted a structured literature review of self-supervised learning (SSL) in 3D medical imaging, comparing representation-learning methods, datasets, evaluation strategies, and clinical applications.</w:t>
       </w:r>
     </w:p>
     <w:p>
@@ -219,7 +219,7 @@
           <w:color w:val="1A202C"/>
           <w:sz w:val="18"/>
         </w:rPr>
-        <w:t>Synthesized academic evidence into a review manuscript that is currently in preparation and has not yet been published.</w:t>
+        <w:t>Identified limitations and open research directions and synthesized the findings into a review manuscript currently in preparation.</w:t>
       </w:r>
     </w:p>
     <w:p>
@@ -297,7 +297,7 @@
           <w:color w:val="1A202C"/>
           <w:sz w:val="18"/>
         </w:rPr>
-        <w:t>Bioinformatics, computer vision, multimodal learning, NLP, medical imaging, benchmarking</w:t>
+        <w:t>Bioinformatics, computer vision, self-supervised learning, NLP, medical imaging, benchmarking</w:t>
       </w:r>
     </w:p>
     <w:p>

</xml_diff>